<commit_message>
Apply user edits to Ch7 FA (voice + phrasing on text-box bullet)
Small wording fixes accepted from the round-trip review:

1. Closing of intro paragraph switched from passive to active voice:
   'این فصل، fix ش هست.' → 'این فصل، fix ش میکنیم.'
2. Bullet 4 (text boxes) — a grammar completion (به‌جای محل اصلی متن),
   an adverbial swap (بطور کامل over کاملاً), and a tempered claim
   (به احتمال خیلی زیاد over تقریباً حتماً) — the last one is more
   defensible in a technical claim about Canva templates.

Rebuilt .docx via build-fa-docx.py — RTL/bidi markers intact.

Co-Authored-By: Claude Opus 4.7 <noreply@anthropic.com>
Claude-Session: https://claude.ai/code/session_013uHhYLNWuZQq9CzW5dkG9w
</commit_message>
<xml_diff>
--- a/bestapply/products/immigrant-job-search-system/chapters/07-the-ats-safe-resume-template.fa.docx
+++ b/bestapply/products/immigrant-job-search-system/chapters/07-the-ats-safe-resume-template.fa.docx
@@ -89,7 +89,7 @@
         <w:rPr>
           <w:rtl/>
         </w:rPr>
-        <w:t xml:space="preserve">رتبه می‌گیرن. Canva، Figma، InDesign — همه‌شون PDF هایی تولید می‌کنن که روی صفحهٔ تو محشرن و برای Workday ناخوانا. این فصل، fix ش هست.</w:t>
+        <w:t xml:space="preserve">رتبه می‌گیرن. Canva، Figma، InDesign — همه‌شون PDF هایی تولید می‌کنن که روی صفحهٔ تو محشرن و برای Workday ناخوانا. این فصل، fix ش میکنیم.</w:t>
       </w:r>
     </w:p>
     <w:p>
@@ -283,7 +283,7 @@
         <w:rPr>
           <w:rtl/>
         </w:rPr>
-        <w:t xml:space="preserve">متن که داخل یه text box شناور قرار می‌گیره (به‌جای اصلی متن)، اکثراً کاملاً skip می‌شه. هر template Canva ای که «sidebar» داره تقریباً حتماً از text box استفاده می‌کنه.</w:t>
+        <w:t xml:space="preserve">متن که داخل یه text box شناور قرار می‌گیره (به‌جای محل اصلی متن)، اکثراً بطور کامل skip می‌شه. هر template Canva ای که «sidebar» داره به احتمال خیلی زیاد از text box استفاده می‌کنه.</w:t>
       </w:r>
     </w:p>
     <w:p>

</xml_diff>